<commit_message>
Implement VPN to general report workflow
</commit_message>
<xml_diff>
--- a/build/pyinstaller/유지보수 보고서 생성기/samples/[템플릿] 유지보수내역.docx
+++ b/build/pyinstaller/유지보수 보고서 생성기/samples/[템플릿] 유지보수내역.docx
@@ -80,21 +80,12 @@
                 <w:sz w:val="18"/>
               </w:rPr>
             </w:pPr>
-            <w:proofErr w:type="spellStart"/>
             <w:r>
               <w:rPr>
                 <w:rFonts w:ascii="굴림체" w:eastAsia="굴림체" w:hAnsi="굴림체" w:hint="eastAsia"/>
                 <w:sz w:val="18"/>
               </w:rPr>
-              <w:t>메디인포</w:t>
-            </w:r>
-            <w:proofErr w:type="spellEnd"/>
-            <w:r>
-              <w:rPr>
-                <w:rFonts w:ascii="굴림체" w:eastAsia="굴림체" w:hAnsi="굴림체" w:hint="eastAsia"/>
-                <w:sz w:val="18"/>
-              </w:rPr>
-              <w:t>(MIS)</w:t>
+              <w:t>메디인포(MIS)</w:t>
             </w:r>
           </w:p>
         </w:tc>
@@ -253,41 +244,13 @@
                 <w:sz w:val="32"/>
               </w:rPr>
             </w:pPr>
-            <w:proofErr w:type="spellStart"/>
             <w:r>
               <w:rPr>
                 <w:rFonts w:ascii="굴림체" w:eastAsia="굴림체" w:hAnsi="굴림체" w:hint="eastAsia"/>
                 <w:b/>
                 <w:sz w:val="32"/>
               </w:rPr>
-              <w:t>조선대병원</w:t>
-            </w:r>
-            <w:proofErr w:type="spellEnd"/>
-            <w:r>
-              <w:rPr>
-                <w:rFonts w:ascii="굴림체" w:eastAsia="굴림체" w:hAnsi="굴림체" w:hint="eastAsia"/>
-                <w:b/>
-                <w:sz w:val="32"/>
-              </w:rPr>
-              <w:t xml:space="preserve"> </w:t>
-            </w:r>
-            <w:proofErr w:type="spellStart"/>
-            <w:r>
-              <w:rPr>
-                <w:rFonts w:ascii="굴림체" w:eastAsia="굴림체" w:hAnsi="굴림체" w:hint="eastAsia"/>
-                <w:b/>
-                <w:sz w:val="32"/>
-              </w:rPr>
-              <w:t>메디인포</w:t>
-            </w:r>
-            <w:proofErr w:type="spellEnd"/>
-            <w:r>
-              <w:rPr>
-                <w:rFonts w:ascii="굴림체" w:eastAsia="굴림체" w:hAnsi="굴림체" w:hint="eastAsia"/>
-                <w:b/>
-                <w:sz w:val="32"/>
-              </w:rPr>
-              <w:t>(MIS)</w:t>
+              <w:t>조선대병원 메디인포(MIS)</w:t>
             </w:r>
           </w:p>
         </w:tc>
@@ -604,7 +567,6 @@
               </w:rPr>
               <w:t>{{</w:t>
             </w:r>
-            <w:proofErr w:type="spellStart"/>
             <w:r>
               <w:rPr>
                 <w:rFonts w:ascii="맑은 고딕" w:eastAsia="맑은 고딕" w:hAnsi="맑은 고딕" w:hint="eastAsia"/>
@@ -617,7 +579,6 @@
               </w:rPr>
               <w:t>일자</w:t>
             </w:r>
-            <w:proofErr w:type="spellEnd"/>
             <w:r>
               <w:rPr>
                 <w:rFonts w:ascii="맑은 고딕" w:eastAsia="맑은 고딕" w:hAnsi="맑은 고딕"/>
@@ -679,32 +640,22 @@
               <w:rPr>
                 <w:rFonts w:ascii="맑은 고딕" w:eastAsia="맑은 고딕" w:hAnsi="맑은 고딕" w:hint="eastAsia"/>
               </w:rPr>
-              <w:t xml:space="preserve">- 처리 </w:t>
+              <w:t>- 처리</w:t>
             </w:r>
             <w:r>
               <w:rPr>
                 <w:rFonts w:ascii="맑은 고딕" w:eastAsia="맑은 고딕" w:hAnsi="맑은 고딕"/>
               </w:rPr>
-              <w:t>{{</w:t>
+              <w:t xml:space="preserve"> </w:t>
             </w:r>
             <w:r>
               <w:rPr>
                 <w:rFonts w:ascii="맑은 고딕" w:eastAsia="맑은 고딕" w:hAnsi="맑은 고딕" w:hint="eastAsia"/>
               </w:rPr>
-              <w:t>진행상태</w:t>
-            </w:r>
-            <w:r>
-              <w:rPr>
-                <w:rFonts w:ascii="맑은 고딕" w:eastAsia="맑은 고딕" w:hAnsi="맑은 고딕" w:hint="eastAsia"/>
-              </w:rPr>
-              <w:t>}</w:t>
-            </w:r>
-            <w:r>
-              <w:rPr>
-                <w:rFonts w:ascii="맑은 고딕" w:eastAsia="맑은 고딕" w:hAnsi="맑은 고딕"/>
-              </w:rPr>
-              <w:t>}</w:t>
-            </w:r>
+              <w:t>완료</w:t>
+            </w:r>
+            <w:bookmarkStart w:id="0" w:name="_GoBack"/>
+            <w:bookmarkEnd w:id="0"/>
           </w:p>
         </w:tc>
         <w:tc>
@@ -728,8 +679,6 @@
       <w:pPr>
         <w:spacing w:line="0" w:lineRule="atLeast"/>
       </w:pPr>
-      <w:bookmarkStart w:id="0" w:name="_GoBack"/>
-      <w:bookmarkEnd w:id="0"/>
     </w:p>
     <w:sectPr>
       <w:headerReference w:type="default" r:id="rId8"/>

</xml_diff>